<commit_message>
Generic AI assistant (not Claude-specific); drop graduate audience
- Replaced all Claude references with a generic "AI assistant" across the
  syllabus (HTML + DOCX), labs, notebooks, projects, README, and the site
- Hebrew rationale now targets second-year undergraduate CS students
  (removed the graduate / second-degree reference)
- Regenerated site, notebooks, HIT package; re-exported syllabus.pdf

Co-Authored-By: Claude Opus 4.8 <noreply@anthropic.com>
</commit_message>
<xml_diff>
--- a/syllabus/syllabus.docx
+++ b/syllabus/syllabus.docx
@@ -1219,7 +1219,7 @@
           <w:sz w:val="26"/>
           <w:szCs w:val="26"/>
         </w:rPr>
-        <w:t>Working with Claude: How the Exercises Are Built</w:t>
+        <w:t>Working with an AI assistant: How the Exercises Are Built</w:t>
       </w:r>
     </w:p>
     <w:p>
@@ -1228,7 +1228,7 @@
         <w:jc w:val="both"/>
       </w:pPr>
       <w:r>
-        <w:t>Students are expected to use an AI assistant such as Claude as a coding partner in this course. That is how practitioners work now, and pretending otherwise would not prepare them for the advanced courses or for practice. The exercises are designed around that reality: Claude can write the boilerplate, but it cannot do the learning for them. Every weekly exercise, therefore, has three parts.</w:t>
+        <w:t>Students are expected to use an AI assistant as a coding partner in this course. That is how practitioners work now, and pretending otherwise would not prepare them for the advanced courses or for practice. The exercises are designed around that reality: An AI assistant can write the boilerplate, but it cannot do the learning for them. Every weekly exercise, therefore, has three parts.</w:t>
       </w:r>
     </w:p>
     <w:p>
@@ -1313,7 +1313,7 @@
                 <w:sz w:val="18"/>
                 <w:szCs w:val="18"/>
               </w:rPr>
-              <w:t>Students produce working code that meets a specification or reaches a target metric, using Claude freely for scaffolding, syntax, and debugging.</w:t>
+              <w:t>Students produce working code that meets a specification or reaches a target metric, using an AI assistant freely for scaffolding, syntax, and debugging.</w:t>
             </w:r>
           </w:p>
         </w:tc>
@@ -1500,7 +1500,7 @@
           <w:b/>
           <w:bCs/>
         </w:rPr>
-        <w:t>critique a Claude-generated solution</w:t>
+        <w:t>critique an AI-generated solution</w:t>
       </w:r>
       <w:r>
         <w:t xml:space="preserve"> that contains a subtle, realistic mistake (a wrong loss, a data leak, a misplaced normalization). Finding it requires understanding, not generation.</w:t>
@@ -1569,7 +1569,7 @@
         <w:t xml:space="preserve">Disclosure. </w:t>
       </w:r>
       <w:r>
-        <w:t>Students note where they used Claude. Using it is encouraged; submitting work they cannot explain is an integrity violation (Section 9).</w:t>
+        <w:t>Students note where they used the AI assistant. Using it is encouraged; submitting work they cannot explain is an integrity violation (Section 9).</w:t>
       </w:r>
     </w:p>
     <w:p>
@@ -1851,7 +1851,7 @@
               <w:t xml:space="preserve">Build: </w:t>
             </w:r>
             <w:r>
-              <w:t>a tiny end-to-end training loop with Claude scaffolding.</w:t>
+              <w:t>a tiny end-to-end training loop with AI-assistant scaffolding.</w:t>
             </w:r>
             <w:r>
               <w:rPr>
@@ -1962,7 +1962,7 @@
               <w:t xml:space="preserve">Build: </w:t>
             </w:r>
             <w:r>
-              <w:t>a set of tensor ops with Claude's help.</w:t>
+              <w:t>a set of tensor ops with an AI assistant's help.</w:t>
             </w:r>
             <w:r>
               <w:rPr>
@@ -2341,7 +2341,7 @@
               <w:t xml:space="preserve">  Learn it: </w:t>
             </w:r>
             <w:r>
-              <w:t>pick the wrong loss on purpose, predict and observe the failure, then critique a Claude-written accuracy metric that is wrong under class imbalance.</w:t>
+              <w:t>pick the wrong loss on purpose, predict and observe the failure, then critique an AI-written accuracy metric that is wrong under class imbalance.</w:t>
             </w:r>
           </w:p>
         </w:tc>
@@ -3160,7 +3160,7 @@
               <w:t xml:space="preserve">  Learn it: </w:t>
             </w:r>
             <w:r>
-              <w:t>probe the latent space (interpolate, cluster), interpret what it captures, and critique a Claude-suggested but flawed contrastive loss.</w:t>
+              <w:t>probe the latent space (interpolate, cluster), interpret what it captures, and critique an AI-suggested but flawed contrastive loss.</w:t>
             </w:r>
           </w:p>
         </w:tc>
@@ -3264,23 +3264,7 @@
                 <w:sz w:val="17"/>
                 <w:szCs w:val="17"/>
               </w:rPr>
-              <w:t xml:space="preserve">Transfer learning and fine-tuning; model inference; the end-to-end workflow </w:t>
-            </w:r>
-            <w:r>
-              <w:rPr>
-                <w:color w:val="5A626C"/>
-                <w:sz w:val="17"/>
-                <w:szCs w:val="17"/>
-              </w:rPr>
-              <w:t>in</w:t>
-            </w:r>
-            <w:r>
-              <w:rPr>
-                <w:color w:val="5A626C"/>
-                <w:sz w:val="17"/>
-                <w:szCs w:val="17"/>
-              </w:rPr>
-              <w:t xml:space="preserve"> the advanced courses.</w:t>
+              <w:t xml:space="preserve">Transfer learning and fine-tuning; model inference; the end-to-end workflow in the advanced courses.</w:t>
             </w:r>
           </w:p>
         </w:tc>
@@ -3310,13 +3294,7 @@
               <w:t xml:space="preserve">Build: </w:t>
             </w:r>
             <w:r>
-              <w:t xml:space="preserve">fine-tune a pretrained model </w:t>
-            </w:r>
-            <w:r>
-              <w:t>end-to-end</w:t>
-            </w:r>
-            <w:r>
-              <w:t>.</w:t>
+              <w:t xml:space="preserve">fine-tune a pretrained model end-to-end.</w:t>
             </w:r>
             <w:r>
               <w:rPr>
@@ -3937,7 +3915,7 @@
         <w:jc w:val="both"/>
       </w:pPr>
       <w:r>
-        <w:t>Working solo or in a pair, students take a task end to end: frame it, build a suitable architecture from the families covered in the course, train and tune it, diagnose failures, and report results. Students may use Claude throughout. Deliverables are a one-page proposal (around week 8), a code submission, a short report with curves and discussion, a half-page reflection on what Claude did versus what they had to work out themselves, and a short oral defense in which they explain their design decisions. The oral defense is where understanding, rather than authorship, is confirmed.</w:t>
+        <w:t>Working solo or in a pair, students take a task end to end: frame it, build a suitable architecture from the families covered in the course, train and tune it, diagnose failures, and report results. Students may use an AI assistant throughout. Deliverables are a one-page proposal (around week 8), a code submission, a short report with curves and discussion, a half-page reflection on what the AI assistant did versus what they had to work out themselves, and a short oral defense in which they explain their design decisions. The oral defense is where understanding, rather than authorship, is confirmed.</w:t>
       </w:r>
     </w:p>
     <w:p>
@@ -4005,7 +3983,7 @@
         <w:t xml:space="preserve">AI assistant: </w:t>
       </w:r>
       <w:r>
-        <w:t>Claude (or an equivalent) is part of the toolkit and is expected for the Build portion of exercises.</w:t>
+        <w:t>An AI assistant is part of the toolkit and is expected for the Build portion of exercises.</w:t>
       </w:r>
     </w:p>
     <w:p>

</xml_diff>